<commit_message>
changed website docs for reports
</commit_message>
<xml_diff>
--- a/assets/docs/Sprawozdanie2019.docx
+++ b/assets/docs/Sprawozdanie2019.docx
@@ -89,7 +89,7 @@
               <mc:AlternateContent>
                 <mc:Choice Requires="wps">
                   <w:drawing>
-                    <wp:anchor behindDoc="0" distT="0" distB="0" distL="114300" distR="114300" simplePos="0" locked="0" layoutInCell="1" allowOverlap="1" relativeHeight="2" wp14:anchorId="1D076CF9">
+                    <wp:anchor distT="0" distB="0" distL="114300" distR="114300" simplePos="0" relativeHeight="2" behindDoc="0" locked="0" layoutInCell="1" allowOverlap="1" wp14:anchorId="1D076CF9">
                       <wp:simplePos x="0" y="0"/>
                       <wp:positionH relativeFrom="column">
                         <wp:posOffset>4451350</wp:posOffset>
@@ -141,7 +141,7 @@
                               <w:txbxContent>
                                 <w:p>
                                   <w:pPr>
-                                    <w:pStyle w:val="Zawartoramki"/>
+                                    <w:pStyle w:val="Zawartoramkiuser"/>
                                     <w:rPr>
                                       <w:color w:val="000000"/>
                                     </w:rPr>
@@ -155,7 +155,7 @@
                                 </w:p>
                                 <w:p>
                                   <w:pPr>
-                                    <w:pStyle w:val="Zawartoramki"/>
+                                    <w:pStyle w:val="Zawartoramkiuser"/>
                                     <w:rPr>
                                       <w:color w:val="000000"/>
                                     </w:rPr>
@@ -168,7 +168,7 @@
                                 </w:p>
                                 <w:p>
                                   <w:pPr>
-                                    <w:pStyle w:val="Zawartoramki"/>
+                                    <w:pStyle w:val="Zawartoramkiuser"/>
                                     <w:rPr>
                                       <w:color w:val="000000"/>
                                     </w:rPr>
@@ -192,14 +192,14 @@
                 </mc:Choice>
                 <mc:Fallback>
                   <w:pict>
-                    <v:rect id="shape_0" ID="Pole tekstowe 1" path="m0,0l-2147483645,0l-2147483645,-2147483646l0,-2147483646xe" fillcolor="white" stroked="t" o:allowincell="t" style="position:absolute;margin-left:350.5pt;margin-top:-25.45pt;width:116.4pt;height:23.2pt;mso-wrap-style:square;v-text-anchor:top" wp14:anchorId="1D076CF9">
+                    <v:rect id="shape_0" fillcolor="white" stroked="t" o:allowincell="t" style="position:absolute;margin-left:350.5pt;margin-top:-25.45pt;width:116.4pt;height:23.2pt;mso-wrap-style:square;v-text-anchor:top" wp14:anchorId="1D076CF9">
                       <v:fill o:detectmouseclick="t" type="solid" color2="black"/>
                       <v:stroke color="black" weight="9360" joinstyle="miter" endcap="flat"/>
                       <v:textbox>
                         <w:txbxContent>
                           <w:p>
                             <w:pPr>
-                              <w:pStyle w:val="Zawartoramki"/>
+                              <w:pStyle w:val="Zawartoramkiuser"/>
                               <w:rPr>
                                 <w:color w:val="000000"/>
                               </w:rPr>
@@ -213,7 +213,7 @@
                           </w:p>
                           <w:p>
                             <w:pPr>
-                              <w:pStyle w:val="Zawartoramki"/>
+                              <w:pStyle w:val="Zawartoramkiuser"/>
                               <w:rPr>
                                 <w:color w:val="000000"/>
                               </w:rPr>
@@ -226,7 +226,7 @@
                           </w:p>
                           <w:p>
                             <w:pPr>
-                              <w:pStyle w:val="Zawartoramki"/>
+                              <w:pStyle w:val="Zawartoramkiuser"/>
                               <w:rPr>
                                 <w:color w:val="000000"/>
                               </w:rPr>
@@ -322,7 +322,6 @@
                 <w:b/>
                 <w:bCs/>
                 <w:i w:val="false"/>
-                <w:i w:val="false"/>
                 <w:iCs w:val="false"/>
                 <w:sz w:val="24"/>
                 <w:szCs w:val="24"/>
@@ -355,7 +354,6 @@
                 <w:b/>
                 <w:bCs/>
                 <w:i w:val="false"/>
-                <w:i w:val="false"/>
                 <w:iCs w:val="false"/>
                 <w:sz w:val="24"/>
                 <w:szCs w:val="24"/>
@@ -1390,7 +1388,6 @@
               <w:jc w:val="start"/>
               <w:rPr>
                 <w:i w:val="false"/>
-                <w:i w:val="false"/>
                 <w:iCs w:val="false"/>
                 <w:kern w:val="0"/>
                 <w:sz w:val="22"/>
@@ -3835,7 +3832,7 @@
                 <w:kern w:val="0"/>
                 <w:lang w:val="pl-PL" w:bidi="ar-SA"/>
               </w:rPr>
-              <w:t>TAK</w:t>
+              <w:t>NIE</w:t>
             </w:r>
           </w:p>
         </w:tc>
@@ -4048,7 +4045,9 @@
         </w:rPr>
       </w:pPr>
       <w:r>
-        <w:rPr/>
+        <w:rPr>
+          <w:rFonts w:cs="Times New Roman"/>
+        </w:rPr>
       </w:r>
     </w:p>
     <w:p>
@@ -4827,8 +4826,8 @@
       <w:lang w:eastAsia="pl-PL"/>
     </w:rPr>
   </w:style>
-  <w:style w:type="character" w:styleId="Znakiprzypiswdolnych">
-    <w:name w:val="Znaki przypisów dolnych"/>
+  <w:style w:type="character" w:styleId="Znakiprzypiswdolnychuser">
+    <w:name w:val="Znaki przypisów dolnych (user)"/>
     <w:uiPriority w:val="99"/>
     <w:semiHidden/>
     <w:unhideWhenUsed/>
@@ -4838,8 +4837,8 @@
       <w:vertAlign w:val="superscript"/>
     </w:rPr>
   </w:style>
-  <w:style w:type="character" w:styleId="Znakiprzypiswdolnychuser">
-    <w:name w:val="Znaki przypisów dolnych (user)"/>
+  <w:style w:type="character" w:styleId="Znakiprzypiswdolnych">
+    <w:name w:val="Znaki przypisów dolnych"/>
     <w:qFormat/>
     <w:rPr>
       <w:vertAlign w:val="superscript"/>
@@ -4862,15 +4861,15 @@
       <w:szCs w:val="18"/>
     </w:rPr>
   </w:style>
-  <w:style w:type="character" w:styleId="Znakiprzypiswkocowychuser">
-    <w:name w:val="Znaki przypisów końcowych (user)"/>
+  <w:style w:type="character" w:styleId="Znakiprzypiswkocowych">
+    <w:name w:val="Znaki przypisów końcowych"/>
     <w:qFormat/>
     <w:rPr>
       <w:vertAlign w:val="superscript"/>
     </w:rPr>
   </w:style>
-  <w:style w:type="character" w:styleId="Znakiprzypiswkocowych">
-    <w:name w:val="Znaki przypisów końcowych"/>
+  <w:style w:type="character" w:styleId="Znakiprzypiswkocowychuser">
+    <w:name w:val="Znaki przypisów końcowych (user)"/>
     <w:qFormat/>
     <w:rPr/>
   </w:style>
@@ -5097,6 +5096,55 @@
       <w:szCs w:val="16"/>
     </w:rPr>
   </w:style>
+  <w:style w:type="paragraph" w:styleId="Zawartoramkiuser">
+    <w:name w:val="Zawartość ramki (user)"/>
+    <w:basedOn w:val="Normal"/>
+    <w:qFormat/>
+    <w:pPr/>
+    <w:rPr/>
+  </w:style>
+  <w:style w:type="paragraph" w:styleId="Zawartotabeliuser">
+    <w:name w:val="Zawartość tabeli (user)"/>
+    <w:basedOn w:val="Normal"/>
+    <w:qFormat/>
+    <w:pPr>
+      <w:widowControl w:val="false"/>
+      <w:suppressLineNumbers/>
+    </w:pPr>
+    <w:rPr/>
+  </w:style>
+  <w:style w:type="paragraph" w:styleId="Nagwektabeliuser">
+    <w:name w:val="Nagłówek tabeli (user)"/>
+    <w:basedOn w:val="Zawartotabeliuser"/>
+    <w:qFormat/>
+    <w:pPr>
+      <w:suppressLineNumbers/>
+      <w:jc w:val="center"/>
+    </w:pPr>
+    <w:rPr>
+      <w:b/>
+      <w:bCs/>
+    </w:rPr>
+  </w:style>
+  <w:style w:type="paragraph" w:styleId="normal1">
+    <w:name w:val="normal1"/>
+    <w:qFormat/>
+    <w:pPr>
+      <w:widowControl/>
+      <w:suppressAutoHyphens w:val="true"/>
+      <w:bidi w:val="0"/>
+      <w:spacing w:lineRule="auto" w:line="276" w:before="0" w:after="0"/>
+      <w:jc w:val="start"/>
+    </w:pPr>
+    <w:rPr>
+      <w:rFonts w:ascii="Calibri" w:hAnsi="Calibri" w:eastAsia="Calibri" w:cs="" w:asciiTheme="minorHAnsi" w:cstheme="minorBidi" w:eastAsiaTheme="minorHAnsi" w:hAnsiTheme="minorHAnsi"/>
+      <w:color w:val="auto"/>
+      <w:kern w:val="0"/>
+      <w:sz w:val="22"/>
+      <w:szCs w:val="22"/>
+      <w:lang w:val="pl-PL" w:eastAsia="en-US" w:bidi="ar-SA"/>
+    </w:rPr>
+  </w:style>
   <w:style w:type="paragraph" w:styleId="Zawartoramki">
     <w:name w:val="Zawartość ramki"/>
     <w:basedOn w:val="Normal"/>
@@ -5127,57 +5175,8 @@
       <w:bCs/>
     </w:rPr>
   </w:style>
-  <w:style w:type="paragraph" w:styleId="normal1">
-    <w:name w:val="normal1"/>
-    <w:qFormat/>
-    <w:pPr>
-      <w:widowControl/>
-      <w:suppressAutoHyphens w:val="true"/>
-      <w:bidi w:val="0"/>
-      <w:spacing w:lineRule="auto" w:line="276" w:before="0" w:after="0"/>
-      <w:jc w:val="start"/>
-    </w:pPr>
-    <w:rPr>
-      <w:rFonts w:ascii="Calibri" w:hAnsi="Calibri" w:eastAsia="Calibri" w:cs="" w:asciiTheme="minorHAnsi" w:cstheme="minorBidi" w:eastAsiaTheme="minorHAnsi" w:hAnsiTheme="minorHAnsi"/>
-      <w:color w:val="auto"/>
-      <w:kern w:val="0"/>
-      <w:sz w:val="22"/>
-      <w:szCs w:val="22"/>
-      <w:lang w:val="pl-PL" w:eastAsia="en-US" w:bidi="ar-SA"/>
-    </w:rPr>
-  </w:style>
-  <w:style w:type="paragraph" w:styleId="Zawartoramkiuser">
-    <w:name w:val="Zawartość ramki (user)"/>
-    <w:basedOn w:val="Normal"/>
-    <w:qFormat/>
-    <w:pPr/>
-    <w:rPr/>
-  </w:style>
-  <w:style w:type="paragraph" w:styleId="Zawartotabeliuser">
-    <w:name w:val="Zawartość tabeli (user)"/>
-    <w:basedOn w:val="Normal"/>
-    <w:qFormat/>
-    <w:pPr>
-      <w:widowControl w:val="false"/>
-      <w:suppressLineNumbers/>
-    </w:pPr>
-    <w:rPr/>
-  </w:style>
-  <w:style w:type="paragraph" w:styleId="Nagwektabeliuser">
-    <w:name w:val="Nagłówek tabeli (user)"/>
-    <w:basedOn w:val="Zawartotabeliuser"/>
-    <w:qFormat/>
-    <w:pPr>
-      <w:suppressLineNumbers/>
-      <w:jc w:val="center"/>
-    </w:pPr>
-    <w:rPr>
-      <w:b/>
-      <w:bCs/>
-    </w:rPr>
-  </w:style>
-  <w:style w:type="numbering" w:styleId="Bezlisty" w:default="1">
-    <w:name w:val="Bez listy"/>
+  <w:style w:type="numbering" w:styleId="Bezlistyuser" w:default="1">
+    <w:name w:val="Bez listy (user)"/>
     <w:uiPriority w:val="99"/>
     <w:semiHidden/>
     <w:unhideWhenUsed/>

</xml_diff>